<commit_message>
docs(registros): alinha equipe (GP Abraão, Cézar TL/DevOps/Arq, devs Raony/Mateus/Lucas, QA Caroline, GQA Jonathan)
Co-Authored-By: Claude Opus 4.8 (1M context) <noreply@anthropic.com>
</commit_message>
<xml_diff>
--- a/mps-nivel-c/oficial/04_registros/AASP_Andamento-Processuais/ADAP-AASPAP01-001_Registro-de-Adaptacao.docx
+++ b/mps-nivel-c/oficial/04_registros/AASP_Andamento-Processuais/ADAP-AASPAP01-001_Registro-de-Adaptacao.docx
@@ -450,7 +450,7 @@
                 <w:i w:val="0"/>
                 <w:sz w:val="20"/>
               </w:rPr>
-              <w:t>Cezar Hiraki Velazquez</w:t>
+              <w:t>Cézar Hiraki Velázquez</w:t>
             </w:r>
           </w:p>
         </w:tc>
@@ -1052,7 +1052,7 @@
                 <w:i w:val="0"/>
                 <w:sz w:val="20"/>
               </w:rPr>
-              <w:t>Equipe enxuta; Cezar Hiraki Velazquez concentra GP, Tech Lead e Arquiteto</w:t>
+              <w:t>Equipe enxuta; Cézar Hiraki Velázquez concentra Tech Lead, DevOps e Arquiteto</w:t>
             </w:r>
           </w:p>
         </w:tc>

</xml_diff>

<commit_message>
docs(registros): corrige achados de auditoria (N1 papel GP, N2/M1 citações INTAKE, M2 CR consolidado, M4 banner)
- N1: 'Tech Lead acumula DevOps e Arquiteto' (Abraão é o GP)
- N2/M1: remove citações ao INTAKE (removido do repo) e a data 14/06; troca fonte p/ GEST/registros
- M2: referências a CR-*-002 apontam para o CR consolidado (-001)
- M4: banner com código correto e Versão 1.0

Co-Authored-By: Claude Opus 4.8 (1M context) <noreply@anthropic.com>
</commit_message>
<xml_diff>
--- a/mps-nivel-c/oficial/04_registros/AASP_Andamento-Processuais/ADAP-AASPAP01-001_Registro-de-Adaptacao.docx
+++ b/mps-nivel-c/oficial/04_registros/AASP_Andamento-Processuais/ADAP-AASPAP01-001_Registro-de-Adaptacao.docx
@@ -34,7 +34,7 @@
           <w:color w:val="555555"/>
           <w:sz w:val="20"/>
         </w:rPr>
-        <w:t>Sim   ·   Versão Data   ·   11/06/2026   ·   Timeware Brasil</w:t>
+        <w:t>ADAP-AASPAP01-001   ·   Versão 1.0   ·   11/06/2026   ·   Timeware Brasil</w:t>
       </w:r>
     </w:p>
     <w:p>
@@ -1026,7 +1026,7 @@
                 <w:i w:val="0"/>
                 <w:sz w:val="20"/>
               </w:rPr>
-              <w:t>Tech Lead acumula Arquiteto e Gerência de Projeto</w:t>
+              <w:t>Tech Lead acumula DevOps e Arquiteto</w:t>
             </w:r>
           </w:p>
         </w:tc>
@@ -2508,7 +2508,7 @@
                 <w:i w:val="0"/>
                 <w:sz w:val="20"/>
               </w:rPr>
-              <w:t>Registro de adaptação consolidado a partir do Registro de Projeto AASP_AndamentosProcessuais (REG-AASPAP01-001 v1.0, 08/06/2026) e do levantamento de projeto (INTAKE-PROJETO_AASPAP01 v1.0).</w:t>
+              <w:t>Registro de adaptação consolidado a partir do Registro de Projeto AASP_AndamentosProcessuais (REG-AASPAP01-001 v1.0, 08/06/2026) e do levantamento de projeto (GEST-AASPAP01).</w:t>
             </w:r>
           </w:p>
         </w:tc>

</xml_diff>

<commit_message>
docs(registros): AASP_AndamentosProcessuais — reconcilia ferramenta para GitLab + links de evidência
A solução é versionada no GitLab self-hospedado (o "Azure DevOps" nos documentos era
resíduo de cópia do projeto irmão AASP_CNJ). Ajustes cross-verificados pelas telas do repositório:
- Plataforma GitLab + Merge Requests (antes "Azure DevOps"/"Pull Request") em GCO/ITP/ADAP/REV/PLA/TAP/VV
- GitFlow develop/homolog/prod (antes "main"); baselines BL-CNJ/BL-HOTFIX = releases v2.0.0/v2.0.1
- GCO: nova seção "7. Acesso e evidências (GitLab · Jira)" com links de repositório, Merge Requests,
  commits (branch prod), releases e backlog no Jira (projeto ADPRC)

https://claude.ai/code/session_01D9YHKrGanfZsACSZKYQDTp
</commit_message>
<xml_diff>
--- a/mps-nivel-c/oficial/04_registros/AASP_Andamento-Processuais/ADAP-AASPAP01-001_Registro-de-Adaptacao.docx
+++ b/mps-nivel-c/oficial/04_registros/AASP_Andamento-Processuais/ADAP-AASPAP01-001_Registro-de-Adaptacao.docx
@@ -1183,13 +1183,7 @@
               <w:spacing w:before="40" w:after="40"/>
             </w:pPr>
             <w:r>
-              <w:rPr>
-                <w:rFonts w:ascii="Calibri" w:hAnsi="Calibri"/>
-                <w:b w:val="0"/>
-                <w:i w:val="0"/>
-                <w:sz w:val="20"/>
-              </w:rPr>
-              <w:t>PR no Azure DevOps, revisada por ≥1 membro além do autor (GitFlow)</w:t>
+              <w:t>Merge Request (MR) no GitLab, revisado por ≥1 membro além do autor (GitFlow)</w:t>
             </w:r>
           </w:p>
         </w:tc>
@@ -1264,13 +1258,7 @@
               <w:spacing w:before="40" w:after="40"/>
             </w:pPr>
             <w:r>
-              <w:rPr>
-                <w:rFonts w:ascii="Calibri" w:hAnsi="Calibri"/>
-                <w:b w:val="0"/>
-                <w:i w:val="0"/>
-                <w:sz w:val="20"/>
-              </w:rPr>
-              <w:t>GMUD — pacotes versionados + DDL no Azure DevOps</w:t>
+              <w:t>GMUD — pacotes versionados + DDL no GitLab</w:t>
             </w:r>
           </w:p>
         </w:tc>

</xml_diff>

<commit_message>
docs(registros): AASPAP — migra referências de gestão (ClickUp) para o GitLab
A gestão do projeto (atividades, horas, backlog e alinhamentos) passou a ser feita no
GitLab. Substitui as menções ao ClickUp em ADAP, GCO, MED, PLA, RAC e VV.

https://claude.ai/code/session_01D9YHKrGanfZsACSZKYQDTp
</commit_message>
<xml_diff>
--- a/mps-nivel-c/oficial/04_registros/AASP_Andamento-Processuais/ADAP-AASPAP01-001_Registro-de-Adaptacao.docx
+++ b/mps-nivel-c/oficial/04_registros/AASP_Andamento-Processuais/ADAP-AASPAP01-001_Registro-de-Adaptacao.docx
@@ -1101,13 +1101,7 @@
               <w:spacing w:before="40" w:after="40"/>
             </w:pPr>
             <w:r>
-              <w:rPr>
-                <w:rFonts w:ascii="Calibri" w:hAnsi="Calibri"/>
-                <w:b w:val="0"/>
-                <w:i w:val="0"/>
-                <w:sz w:val="20"/>
-              </w:rPr>
-              <w:t>Gestão por horas/cards no ClickUp; sem story points (gestão por fases)</w:t>
+              <w:t>Gestão por horas/cards no GitLab (issues/quadro); sem story points (gestão por fases)</w:t>
             </w:r>
           </w:p>
         </w:tc>

</xml_diff>

<commit_message>
docs(AASPAP01): SI-01 — coerencia de datas (remediacao da auditoria MPS-C)
Corrige o achado sistemico nº1 da auditoria (datas incoerentes / "fonte futura"):
- Carimbo de cabecalho "· 11/06/2026 ·" alinhado a data real de fase do doc (19 docs).
- "Versao Data" -> "Versao 1.0" no carimbo dos CR-001/CR-002.
- Removida a data futura da proveniencia "(REG-AASPAP01-001 v1.0, 08/06/2026)" (5 docs).
- GQA: reconciliada a contradicao §1 ("0 desvios/100%") com a tabela (GCO-3 pendente).

Verificado: 0 carimbos divergentes, 0 'Versao Data', 0 proveniencia-futura, 25/25 docx abrem.
Demais achados (baseline REG-AASPAP01-001, encerramento, papeis na matriz org, campos
de responsavel, criterios de aceite) ficam para decisao — ver REMEDIACAO_AUDITORIA_AASPAP01.md.

Co-Authored-By: Claude Opus 4.8 (1M context) <noreply@anthropic.com>
</commit_message>
<xml_diff>
--- a/mps-nivel-c/oficial/04_registros/AASP_Andamento-Processuais/ADAP-AASPAP01-001_Registro-de-Adaptacao.docx
+++ b/mps-nivel-c/oficial/04_registros/AASP_Andamento-Processuais/ADAP-AASPAP01-001_Registro-de-Adaptacao.docx
@@ -34,7 +34,7 @@
           <w:color w:val="555555"/>
           <w:sz w:val="20"/>
         </w:rPr>
-        <w:t>ADAP-AASPAP01-001   ·   Versão 1.0   ·   11/06/2026   ·   Timeware Brasil</w:t>
+        <w:t>ADAP-AASPAP01-001   ·   Versão 1.0   ·   16/12/2025   ·   Timeware Brasil</w:t>
       </w:r>
     </w:p>
     <w:p>
@@ -2177,7 +2177,7 @@
           <w:i w:val="0"/>
           <w:sz w:val="22"/>
         </w:rPr>
-        <w:t>[x] Plano de Projeto aprovado (baseline REG-AASPAP01-001 v1.0, 08/06/2026)</w:t>
+        <w:t>[x] Plano de Projeto aprovado (baseline REG-AASPAP01-001 v1.0)</w:t>
       </w:r>
     </w:p>
     <w:p>
@@ -2463,7 +2463,7 @@
                 <w:i w:val="0"/>
                 <w:sz w:val="20"/>
               </w:rPr>
-              <w:t>Registro de adaptação consolidado a partir do Registro de Projeto AASP_AndamentosProcessuais (REG-AASPAP01-001 v1.0, 08/06/2026) e do levantamento de projeto (GEST-AASPAP01).</w:t>
+              <w:t>Registro de adaptação consolidado a partir do Registro de Projeto AASP_AndamentosProcessuais (REG-AASPAP01-001 v1.0) e do levantamento de projeto (GEST-AASPAP01).</w:t>
             </w:r>
           </w:p>
         </w:tc>

</xml_diff>